<commit_message>
docs: Update user credentials and document structure in build report
</commit_message>
<xml_diff>
--- a/docs/گزارش-پروژه-پایانی-بیمه-تکمیلی.docx
+++ b/docs/گزارش-پروژه-پایانی-بیمه-تکمیلی.docx
@@ -10115,7 +10115,7 @@
                 <w:sz w:val="20"/>
                 <w:szCs w:val="20"/>
               </w:rPr>
-              <w:t>Admin123!</w:t>
+              <w:t>Admin123!‎</w:t>
             </w:r>
           </w:p>
         </w:tc>
@@ -10191,7 +10191,7 @@
                 <w:sz w:val="20"/>
                 <w:szCs w:val="20"/>
               </w:rPr>
-              <w:t>Reviewer123!</w:t>
+              <w:t>Reviewer123!‎</w:t>
             </w:r>
           </w:p>
         </w:tc>
@@ -10243,7 +10243,7 @@
                 <w:sz w:val="20"/>
                 <w:szCs w:val="20"/>
               </w:rPr>
-              <w:t>sara.ahmadi</w:t>
+              <w:t>saeed.mazahery</w:t>
             </w:r>
           </w:p>
         </w:tc>
@@ -10266,7 +10266,7 @@
                 <w:sz w:val="20"/>
                 <w:szCs w:val="20"/>
               </w:rPr>
-              <w:t>Employee123!</w:t>
+              <w:t>Employee123!‎</w:t>
             </w:r>
           </w:p>
         </w:tc>
@@ -10318,7 +10318,7 @@
                 <w:sz w:val="20"/>
                 <w:szCs w:val="20"/>
               </w:rPr>
-              <w:t>reza.karimi</w:t>
+              <w:t>farzin.hamzei</w:t>
             </w:r>
           </w:p>
         </w:tc>
@@ -10342,7 +10342,7 @@
                 <w:sz w:val="20"/>
                 <w:szCs w:val="20"/>
               </w:rPr>
-              <w:t>Employee123!</w:t>
+              <w:t>Employee123!‎</w:t>
             </w:r>
           </w:p>
         </w:tc>
@@ -10417,7 +10417,7 @@
                 <w:sz w:val="20"/>
                 <w:szCs w:val="20"/>
               </w:rPr>
-              <w:t>Auditor123!</w:t>
+              <w:t>Auditor123!‎</w:t>
             </w:r>
           </w:p>
         </w:tc>
@@ -10681,7 +10681,7 @@
                 <w:sz w:val="20"/>
                 <w:szCs w:val="20"/>
               </w:rPr>
-              <w:t>backend/cmd/seed</w:t>
+              <w:t>backend/cmd/createadmin</w:t>
             </w:r>
           </w:p>
         </w:tc>
@@ -10704,7 +10704,7 @@
                 <w:sz w:val="20"/>
                 <w:szCs w:val="20"/>
               </w:rPr>
-              <w:t>بارگذاری داده نمونه</w:t>
+              <w:t>ساخت حساب مدیر سامانه</w:t>
             </w:r>
           </w:p>
         </w:tc>
@@ -10733,6 +10733,58 @@
                 <w:sz w:val="20"/>
                 <w:szCs w:val="20"/>
               </w:rPr>
+              <w:t>backend/db</w:t>
+            </w:r>
+          </w:p>
+        </w:tc>
+        <w:tc>
+          <w:tcPr>
+            <w:tcW w:type="dxa" w:w="5102"/>
+            <w:shd w:val="clear" w:color="auto" w:fill="F2F5F9"/>
+          </w:tcPr>
+          <w:p>
+            <w:pPr>
+              <w:bidi/>
+              <w:spacing w:after="40" w:before="40" w:line="276" w:lineRule="auto"/>
+              <w:jc w:val="right"/>
+            </w:pPr>
+            <w:r/>
+            <w:r>
+              <w:rPr>
+                <w:rFonts w:ascii="Tahoma" w:hAnsi="Tahoma" w:cs="Tahoma"/>
+                <w:b w:val="0"/>
+                <w:color w:val="1A1A1A"/>
+                <w:sz w:val="20"/>
+                <w:szCs w:val="20"/>
+              </w:rPr>
+              <w:t>شِمای پایگاه داده (init.sql) و داده نمونه (seed.sql)</w:t>
+            </w:r>
+          </w:p>
+        </w:tc>
+      </w:tr>
+      <w:tr>
+        <w:trPr>
+          <w:cantSplit/>
+        </w:trPr>
+        <w:tc>
+          <w:tcPr>
+            <w:tcW w:type="dxa" w:w="3402"/>
+          </w:tcPr>
+          <w:p>
+            <w:pPr>
+              <w:bidi/>
+              <w:spacing w:after="40" w:before="40" w:line="276" w:lineRule="auto"/>
+              <w:jc w:val="right"/>
+            </w:pPr>
+            <w:r/>
+            <w:r>
+              <w:rPr>
+                <w:rFonts w:ascii="Tahoma" w:hAnsi="Tahoma" w:cs="Tahoma"/>
+                <w:b w:val="0"/>
+                <w:color w:val="1A1A1A"/>
+                <w:sz w:val="20"/>
+                <w:szCs w:val="20"/>
+              </w:rPr>
               <w:t>backend/internal/domain</w:t>
             </w:r>
           </w:p>
@@ -10740,7 +10792,6 @@
         <w:tc>
           <w:tcPr>
             <w:tcW w:type="dxa" w:w="5102"/>
-            <w:shd w:val="clear" w:color="auto" w:fill="F2F5F9"/>
           </w:tcPr>
           <w:p>
             <w:pPr>
@@ -10769,6 +10820,7 @@
         <w:tc>
           <w:tcPr>
             <w:tcW w:type="dxa" w:w="3402"/>
+            <w:shd w:val="clear" w:color="auto" w:fill="F2F5F9"/>
           </w:tcPr>
           <w:p>
             <w:pPr>
@@ -10792,6 +10844,7 @@
         <w:tc>
           <w:tcPr>
             <w:tcW w:type="dxa" w:w="5102"/>
+            <w:shd w:val="clear" w:color="auto" w:fill="F2F5F9"/>
           </w:tcPr>
           <w:p>
             <w:pPr>
@@ -10820,7 +10873,6 @@
         <w:tc>
           <w:tcPr>
             <w:tcW w:type="dxa" w:w="3402"/>
-            <w:shd w:val="clear" w:color="auto" w:fill="F2F5F9"/>
           </w:tcPr>
           <w:p>
             <w:pPr>
@@ -10844,7 +10896,6 @@
         <w:tc>
           <w:tcPr>
             <w:tcW w:type="dxa" w:w="5102"/>
-            <w:shd w:val="clear" w:color="auto" w:fill="F2F5F9"/>
           </w:tcPr>
           <w:p>
             <w:pPr>
@@ -10873,6 +10924,7 @@
         <w:tc>
           <w:tcPr>
             <w:tcW w:type="dxa" w:w="3402"/>
+            <w:shd w:val="clear" w:color="auto" w:fill="F2F5F9"/>
           </w:tcPr>
           <w:p>
             <w:pPr>
@@ -10896,6 +10948,7 @@
         <w:tc>
           <w:tcPr>
             <w:tcW w:type="dxa" w:w="5102"/>
+            <w:shd w:val="clear" w:color="auto" w:fill="F2F5F9"/>
           </w:tcPr>
           <w:p>
             <w:pPr>
@@ -10924,6 +10977,57 @@
         <w:tc>
           <w:tcPr>
             <w:tcW w:type="dxa" w:w="3402"/>
+          </w:tcPr>
+          <w:p>
+            <w:pPr>
+              <w:bidi/>
+              <w:spacing w:after="40" w:before="40" w:line="276" w:lineRule="auto"/>
+              <w:jc w:val="right"/>
+            </w:pPr>
+            <w:r/>
+            <w:r>
+              <w:rPr>
+                <w:rFonts w:ascii="Tahoma" w:hAnsi="Tahoma" w:cs="Tahoma"/>
+                <w:b w:val="0"/>
+                <w:color w:val="1A1A1A"/>
+                <w:sz w:val="20"/>
+                <w:szCs w:val="20"/>
+              </w:rPr>
+              <w:t>backend/internal/platform</w:t>
+            </w:r>
+          </w:p>
+        </w:tc>
+        <w:tc>
+          <w:tcPr>
+            <w:tcW w:type="dxa" w:w="5102"/>
+          </w:tcPr>
+          <w:p>
+            <w:pPr>
+              <w:bidi/>
+              <w:spacing w:after="40" w:before="40" w:line="276" w:lineRule="auto"/>
+              <w:jc w:val="right"/>
+            </w:pPr>
+            <w:r/>
+            <w:r>
+              <w:rPr>
+                <w:rFonts w:ascii="Tahoma" w:hAnsi="Tahoma" w:cs="Tahoma"/>
+                <w:b w:val="0"/>
+                <w:color w:val="1A1A1A"/>
+                <w:sz w:val="20"/>
+                <w:szCs w:val="20"/>
+              </w:rPr>
+              <w:t>زیرساخت: پیکربندی، ذخیره فایل، ثبت وقایع</w:t>
+            </w:r>
+          </w:p>
+        </w:tc>
+      </w:tr>
+      <w:tr>
+        <w:trPr>
+          <w:cantSplit/>
+        </w:trPr>
+        <w:tc>
+          <w:tcPr>
+            <w:tcW w:type="dxa" w:w="3402"/>
             <w:shd w:val="clear" w:color="auto" w:fill="F2F5F9"/>
           </w:tcPr>
           <w:p>
@@ -10941,7 +11045,7 @@
                 <w:sz w:val="20"/>
                 <w:szCs w:val="20"/>
               </w:rPr>
-              <w:t>backend/migrations</w:t>
+              <w:t>backend/internal/app</w:t>
             </w:r>
           </w:p>
         </w:tc>
@@ -10965,7 +11069,7 @@
                 <w:sz w:val="20"/>
                 <w:szCs w:val="20"/>
               </w:rPr>
-              <w:t>مهاجرت‌های شِمای پایگاه داده</w:t>
+              <w:t>محل سیم‌کشی وابستگی‌ها</w:t>
             </w:r>
           </w:p>
         </w:tc>
@@ -11201,13 +11305,66 @@
                 <w:sz w:val="20"/>
                 <w:szCs w:val="20"/>
               </w:rPr>
-              <w:t>deploy/</w:t>
+              <w:t>scripts/</w:t>
             </w:r>
           </w:p>
         </w:tc>
         <w:tc>
           <w:tcPr>
             <w:tcW w:type="dxa" w:w="5102"/>
+          </w:tcPr>
+          <w:p>
+            <w:pPr>
+              <w:bidi/>
+              <w:spacing w:after="40" w:before="40" w:line="276" w:lineRule="auto"/>
+              <w:jc w:val="right"/>
+            </w:pPr>
+            <w:r/>
+            <w:r>
+              <w:rPr>
+                <w:rFonts w:ascii="Tahoma" w:hAnsi="Tahoma" w:cs="Tahoma"/>
+                <w:b w:val="0"/>
+                <w:color w:val="1A1A1A"/>
+                <w:sz w:val="20"/>
+                <w:szCs w:val="20"/>
+              </w:rPr>
+              <w:t>اجرای محلی سامانه بدون Docker</w:t>
+            </w:r>
+          </w:p>
+        </w:tc>
+      </w:tr>
+      <w:tr>
+        <w:trPr>
+          <w:cantSplit/>
+        </w:trPr>
+        <w:tc>
+          <w:tcPr>
+            <w:tcW w:type="dxa" w:w="3402"/>
+            <w:shd w:val="clear" w:color="auto" w:fill="F2F5F9"/>
+          </w:tcPr>
+          <w:p>
+            <w:pPr>
+              <w:bidi/>
+              <w:spacing w:after="40" w:before="40" w:line="276" w:lineRule="auto"/>
+              <w:jc w:val="right"/>
+            </w:pPr>
+            <w:r/>
+            <w:r>
+              <w:rPr>
+                <w:rFonts w:ascii="Tahoma" w:hAnsi="Tahoma" w:cs="Tahoma"/>
+                <w:b w:val="0"/>
+                <w:color w:val="1A1A1A"/>
+                <w:sz w:val="20"/>
+                <w:szCs w:val="20"/>
+              </w:rPr>
+              <w:t>docker-compose.yml</w:t>
+            </w:r>
+          </w:p>
+        </w:tc>
+        <w:tc>
+          <w:tcPr>
+            <w:tcW w:type="dxa" w:w="5102"/>
+            <w:shd w:val="clear" w:color="auto" w:fill="F2F5F9"/>
           </w:tcPr>
           <w:p>
             <w:pPr>
@@ -11236,7 +11393,6 @@
         <w:tc>
           <w:tcPr>
             <w:tcW w:type="dxa" w:w="3402"/>
-            <w:shd w:val="clear" w:color="auto" w:fill="F2F5F9"/>
           </w:tcPr>
           <w:p>
             <w:pPr>
@@ -11260,7 +11416,6 @@
         <w:tc>
           <w:tcPr>
             <w:tcW w:type="dxa" w:w="5102"/>
-            <w:shd w:val="clear" w:color="auto" w:fill="F2F5F9"/>
           </w:tcPr>
           <w:p>
             <w:pPr>

</xml_diff>